<commit_message>
fix: tighten AI-Startklar data guardrails
</commit_message>
<xml_diff>
--- a/deliverables/ai-startklar/vertrieb/03-fit-risikocheck.docx
+++ b/deliverables/ai-startklar/vertrieb/03-fit-risikocheck.docx
@@ -483,7 +483,7 @@
                 <w:color w:val="0F172A"/>
                 <w:sz w:val="15"/>
               </w:rPr>
-              <w:t>Reale rote Daten: ungeprüfte vertrauliche Dokumente, Zugangsdaten, Geschäfts- oder Berufsgeheimnisse in öffentlichem Tool</w:t>
+              <w:t>Reale personenbezogene, vertrauliche, sicherheitsrelevante oder rote Daten: immer stoppen / zuerst prüfen und niemals in Live-Übungen eingeben</w:t>
             </w:r>
           </w:p>
         </w:tc>
@@ -678,7 +678,7 @@
                 <w:color w:val="0F172A"/>
                 <w:sz w:val="15"/>
               </w:rPr>
-              <w:t>Synthetische, anonymisierte oder ausdrücklich freigegebene Beispiele</w:t>
+              <w:t>Ausschließlich synthetische oder robust anonymisierte, sichere Beispiele</w:t>
             </w:r>
           </w:p>
         </w:tc>

</xml_diff>